<commit_message>
docs: align JIT concept with setup guide (collector vs. Arc object, allowlist after setup, no manual DCR)
Co-authored-by: Copilot <223556219+Copilot@users.noreply.github.com>
</commit_message>
<xml_diff>
--- a/docs/ODA-JIT-EnterpriseAdmin-Konzept.docx
+++ b/docs/ODA-JIT-EnterpriseAdmin-Konzept.docx
@@ -127,7 +127,7 @@
               <w:rPr>
                 <w:sz w:val="19"/>
               </w:rPr>
-              <w:t>0.2 – Entwurf zur Abstimmung (Engage Center Connector, Skripte)</w:t>
+              <w:t>0.3 – Entwurf zur Abstimmung (Begriffe Collector/Arc-Objekt, Allowlist)</w:t>
             </w:r>
           </w:p>
         </w:tc>
@@ -3217,7 +3217,7 @@
               <w:rPr>
                 <w:sz w:val="19"/>
               </w:rPr>
-              <w:t>Eine RG je Forest mit Arc-Collector, LAW und DCR</w:t>
+              <w:t>Eine RG je Forest mit Arc-Objekt des Collectors und LAW</w:t>
             </w:r>
           </w:p>
         </w:tc>
@@ -3349,7 +3349,7 @@
               <w:rPr>
                 <w:sz w:val="19"/>
               </w:rPr>
-              <w:t>Je Forest ein Arc-Server mit AMA-Extension und einer DCR auf den LAW dieses Forests</w:t>
+              <w:t>Je Forest ein Collector-Server on-prem, per Arc verbunden, mit AMA-Extension. Die ODA-Aufgaben werden mit -LogAnalyticsWorkspaceId des Forest-LAW registriert</w:t>
             </w:r>
           </w:p>
         </w:tc>
@@ -3363,7 +3363,7 @@
               <w:rPr>
                 <w:sz w:val="19"/>
               </w:rPr>
-              <w:t>Zuordnung Collector → LAW ist eindeutig</w:t>
+              <w:t>Zuordnung Collector → LAW ist eindeutig (Setup-Leitfaden C2)</w:t>
             </w:r>
           </w:p>
         </w:tc>
@@ -3677,7 +3677,7 @@
         <w:rPr>
           <w:i w:val="0"/>
         </w:rPr>
-        <w:t>Ein Arc-Collector, auf dem ein gMSA zeitweise Enterprise Admin wird, ist ein Tier-0-Asset seines Forests. Wer in Azure Code auf dem Collector ausführen kann (Run Command, Extensions, Contributor auf der Arc-Ressource), kann während des Fensters EA-Rechte missbrauchen. Daher:</w:t>
+        <w:t>Begriffe wie im Setup-Leitfaden (Abschnitt 1.2): Der Collector-Server ist der Windows-Server on-prem. Das Arc-Objekt ist sein Abbild in Azure (Microsoft.HybridCompute/machines in der RG des Forests). Rechte am Arc-Objekt wirken direkt auf den Server. Wer in Azure Code auf dem Collector ausführen kann (Run Command, Extensions, Contributor auf dem Arc-Objekt), kann während des Fensters die EA-Rechte missbrauchen. Collector-Server UND Arc-Objekt sind deshalb Tier-0 des Forests. Daher:</w:t>
       </w:r>
     </w:p>
     <w:p>
@@ -3695,7 +3695,7 @@
         <w:spacing w:after="40"/>
       </w:pPr>
       <w:r>
-        <w:t>Auf dem Collector eine Extension-Allowlist setzen, z. B. azcmagent config set extensions.allowlist "Microsoft.Azure.Monitor/AzureMonitorWindowsAgent". Remote-Ausführung (Run Command) einschränken.</w:t>
+        <w:t>Extension-Allowlist erst NACH der Einrichtung der Assessments setzen. Dann in der Liste genau die Extensions erlauben, die am Arc-Objekt installiert sind (mindestens Microsoft.Azure.Monitor/AzureMonitorWindowsAgent), z. B. azcmagent config set extensions.allowlist "Microsoft.Azure.Monitor/AzureMonitorWindowsAgent,&lt;weitere&gt;". Wird sie zu früh oder zu eng gesetzt, kann das Hinzufügen der Assessments scheitern (Setup-Leitfaden B8). Remote-Ausführung (Run Command) nicht freigeben.</w:t>
       </w:r>
     </w:p>
     <w:p>
@@ -3704,8 +3704,47 @@
         <w:spacing w:after="40"/>
       </w:pPr>
       <w:r>
-        <w:t>Der Zugriff von Microsoft (CSA/Engineer) erfolgt nur lesend über Log Analytics Reader auf dem LAW, nie über die Collector-Ressource.</w:t>
+        <w:t>Der Zugriff von Microsoft (CSA/Engineer) erfolgt nur lesend über Log Analytics Reader auf dem LAW, nie über das Arc-Objekt.</w:t>
       </w:r>
+    </w:p>
+    <w:tbl>
+      <w:tblPr>
+        <w:tblStyle w:val="TableGrid"/>
+        <w:tblW w:type="auto" w:w="0"/>
+        <w:tblLook w:firstColumn="1" w:firstRow="1" w:lastColumn="0" w:lastRow="0" w:noHBand="0" w:noVBand="1" w:val="04A0"/>
+      </w:tblPr>
+      <w:tblGrid>
+        <w:gridCol w:w="9746"/>
+      </w:tblGrid>
+      <w:tr>
+        <w:tc>
+          <w:tcPr>
+            <w:tcW w:type="dxa" w:w="9746"/>
+            <w:shd w:val="clear" w:color="auto" w:fill="DEEBF7"/>
+          </w:tcPr>
+          <w:p>
+            <w:r/>
+            <w:r>
+              <w:rPr>
+                <w:b/>
+                <w:sz w:val="19"/>
+              </w:rPr>
+              <w:t xml:space="preserve">JIT und Arc: </w:t>
+            </w:r>
+            <w:r>
+              <w:rPr>
+                <w:sz w:val="19"/>
+              </w:rPr>
+              <w:t>Die JIT-Skripte (Grant, Watcher) sprechen den Collector-Server direkt über das Netzwerk an: CIM für den Aufgaben- und Prozessstatus, die Admin-Freigabe C$ für die Ergebnisdateien. Sie laufen vom Tier-0-Host aus, nicht über Azure Arc. Der Konfigurationswert „Collector“ ist deshalb der FQDN des Servers on-prem, nicht der Name des Arc-Objekts. Die JIT-Steuerung funktioniert auch, wenn Azure nicht erreichbar ist.</w:t>
+            </w:r>
+          </w:p>
+        </w:tc>
+      </w:tr>
+    </w:tbl>
+    <w:p>
+      <w:pPr>
+        <w:spacing w:after="40"/>
+      </w:pPr>
     </w:p>
     <w:p>
       <w:pPr>

</xml_diff>

<commit_message>
docs: add ODA-JIT Tier-0 deployment guide (EN/DE + Word) and rename config template to ODAJit.example.psd1
- docs/ODA-JIT-Deployment(.de).md: required FullEA files, placement on the Tier-0 host, executor gMSA rights, ports, per-forest setup steps, trial run, operations, troubleshooting
- docs/ODA-JIT-Deployment.de.docx generated from the German guide
- Consistent file naming: ODA-JIT.example.psd1 -> ODAJit.example.psd1, per-forest configs ODAJit.<forest>.psd1
- README EN/DE and docs index link the deployment guide

Co-authored-by: Copilot <223556219+Copilot@users.noreply.github.com>
</commit_message>
<xml_diff>
--- a/docs/ODA-JIT-EnterpriseAdmin-Konzept.docx
+++ b/docs/ODA-JIT-EnterpriseAdmin-Konzept.docx
@@ -2930,7 +2930,7 @@
         <w:t xml:space="preserve">Gleiche Skripte, eigene Konfiguration: </w:t>
       </w:r>
       <w:r>
-        <w:t>Invoke-ODAJitDelegation.ps1, Grant und Watcher bleiben gleich. Je Forest gibt es eine eigene Parameterdatei (z. B. ODA-JIT.&lt;Forest&gt;.psd1) mit Root-DC, Standort-GCs, Gruppen-DN, Collector, WorkingDirectory und Zeitfenster.</w:t>
+        <w:t>Invoke-ODAJitDelegation.ps1, Grant und Watcher bleiben gleich. Je Forest gibt es eine eigene Parameterdatei (z. B. ODAJit.&lt;Forest&gt;.psd1) mit Root-DC, Standort-GCs, Gruppen-DN, Collector, WorkingDirectory und Zeitfenster.</w:t>
       </w:r>
     </w:p>
     <w:p>
@@ -5327,7 +5327,7 @@
               <w:rPr>
                 <w:sz w:val="19"/>
               </w:rPr>
-              <w:t>ODA-JIT.example.psd1</w:t>
+              <w:t>ODAJit.example.psd1</w:t>
             </w:r>
           </w:p>
         </w:tc>
@@ -5731,7 +5731,7 @@
           <w:rFonts w:ascii="Consolas" w:hAnsi="Consolas" w:eastAsia="Consolas"/>
           <w:sz w:val="17"/>
         </w:rPr>
-        <w:t>Copy-Item .\ODA-JIT.example.psd1 C:\ODA-JIT\ODA-JIT.forest-a.psd1   # anpassen</w:t>
+        <w:t>Copy-Item .\ODAJit.example.psd1 C:\ODA-JIT\ODAJit.forest-a.psd1   # anpassen</w:t>
       </w:r>
     </w:p>
     <w:p>
@@ -5745,7 +5745,7 @@
           <w:rFonts w:ascii="Consolas" w:hAnsi="Consolas" w:eastAsia="Consolas"/>
           <w:sz w:val="17"/>
         </w:rPr>
-        <w:t>.\Register-ODAJitTasks.ps1 -ConfigPath C:\ODA-JIT\ODA-JIT.forest-a.psd1</w:t>
+        <w:t>.\Register-ODAJitTasks.ps1 -ConfigPath C:\ODA-JIT\ODAJit.forest-a.psd1</w:t>
       </w:r>
     </w:p>
     <w:p>
@@ -5787,7 +5787,7 @@
           <w:rFonts w:ascii="Consolas" w:hAnsi="Consolas" w:eastAsia="Consolas"/>
           <w:sz w:val="17"/>
         </w:rPr>
-        <w:t>.\Start-ODAJitRevokeWatcher.ps1 -ConfigPath C:\ODA-JIT\ODA-JIT.forest-a.psd1 -WhatIf</w:t>
+        <w:t>.\Start-ODAJitRevokeWatcher.ps1 -ConfigPath C:\ODA-JIT\ODAJit.forest-a.psd1 -WhatIf</w:t>
       </w:r>
     </w:p>
     <w:p>
@@ -5829,7 +5829,7 @@
           <w:rFonts w:ascii="Consolas" w:hAnsi="Consolas" w:eastAsia="Consolas"/>
           <w:sz w:val="17"/>
         </w:rPr>
-        <w:t>.\Start-ODAJitGrant.ps1 -ConfigPath C:\ODA-JIT\ODA-JIT.forest-a.psd1 -StartOdaTasks</w:t>
+        <w:t>.\Start-ODAJitGrant.ps1 -ConfigPath C:\ODA-JIT\ODAJit.forest-a.psd1 -StartOdaTasks</w:t>
       </w:r>
     </w:p>
     <w:p>
@@ -5843,7 +5843,7 @@
           <w:rFonts w:ascii="Consolas" w:hAnsi="Consolas" w:eastAsia="Consolas"/>
           <w:sz w:val="17"/>
         </w:rPr>
-        <w:t>.\Start-ODAJitRevokeWatcher.ps1 -ConfigPath C:\ODA-JIT\ODA-JIT.forest-a.psd1 -WindowStart (Get-Date)</w:t>
+        <w:t>.\Start-ODAJitRevokeWatcher.ps1 -ConfigPath C:\ODA-JIT\ODAJit.forest-a.psd1 -WindowStart (Get-Date)</w:t>
       </w:r>
     </w:p>
     <w:p>
@@ -5885,7 +5885,7 @@
           <w:rFonts w:ascii="Consolas" w:hAnsi="Consolas" w:eastAsia="Consolas"/>
           <w:sz w:val="17"/>
         </w:rPr>
-        <w:t>.\Start-ODAJitRevokeWatcher.ps1 -ConfigPath C:\ODA-JIT\ODA-JIT.forest-a.psd1 -RevokeNow</w:t>
+        <w:t>.\Start-ODAJitRevokeWatcher.ps1 -ConfigPath C:\ODA-JIT\ODAJit.forest-a.psd1 -RevokeNow</w:t>
       </w:r>
     </w:p>
     <w:p>

</xml_diff>